<commit_message>
Christy Sports: add confirmed SMS experience and Denver roots; update profile
Josh confirmed SMS campaigns from GoHighLevel and that he's a Denver
native. Open rates reported as very high; number still needed.

Co-Authored-By: Claude Opus 5.5 <noreply@anthropic.com>
Claude-Session: https://claude.ai/code/session_01PnB2ZnAeZHpQqq3EqeSWtT
</commit_message>
<xml_diff>
--- a/applications/christy-sports-email-marketing-specialist-temp/Rotenberg Resume - Christy Sports - Email Marketing Specialist.docx
+++ b/applications/christy-sports-email-marketing-specialist-temp/Rotenberg Resume - Christy Sports - Email Marketing Specialist.docx
@@ -31,7 +31,7 @@
           <w:color w:val="555555"/>
           <w:sz w:val="23"/>
         </w:rPr>
-        <w:t>Email Marketing &amp; Lifecycle Campaigns | Build, Segment, QA, Deploy &amp; Measure</w:t>
+        <w:t>Email &amp; SMS Marketing | Build, Segment, QA, Deploy &amp; Measure</w:t>
       </w:r>
     </w:p>
     <w:p>
@@ -80,7 +80,7 @@
           <w:i w:val="0"/>
           <w:color w:val="1A1A1A"/>
         </w:rPr>
-        <w:t>Email and lifecycle marketer who takes campaigns from brief to deployment: writing the copy, building the sequence, setting audiences and personalization, checking every link and trigger before launch, and reporting on what worked. Hands-on in HubSpot, Marketo, Mailchimp, and GoHighLevel, with 20+ automated lifecycle workflows built and deployed. Launched e-commerce storefronts for established retail businesses at Wix, and a Colorado local who camps and hikes.</w:t>
+        <w:t>Email and lifecycle marketer who takes campaigns from brief to deployment: writing the copy, building the sequence, setting audiences and personalization, checking every link and trigger before launch, and reporting on what worked. Hands-on in HubSpot, Marketo, Mailchimp, and GoHighLevel, with 20+ automated lifecycle workflows built and deployed. Launched e-commerce storefronts for established retail businesses at Wix. Denver native who camps and hikes.</w:t>
       </w:r>
     </w:p>
     <w:p>
@@ -177,7 +177,7 @@
           <w:i w:val="0"/>
           <w:color w:val="1A1A1A"/>
         </w:rPr>
-        <w:t>Built and deployed 20+ automated lifecycle workflows in GoHighLevel and HubSpot, including onboarding nurture, reminders, win-back and reactivation, and review-generation sequences.</w:t>
+        <w:t>Built and deployed 20+ automated lifecycle workflows in GoHighLevel and HubSpot, including email and SMS onboarding, reminders, reactivation, and review-generation sequences.</w:t>
       </w:r>
     </w:p>
     <w:p>
@@ -627,7 +627,7 @@
           <w:i w:val="0"/>
           <w:color w:val="1A1A1A"/>
         </w:rPr>
-        <w:t>Campaign Build &amp; Deployment, Segmentation &amp; Personalization, Pre-Launch QA, Templates &amp; Reusable Components, A/B Testing</w:t>
+        <w:t>Email &amp; SMS Campaign Build &amp; Deployment, Segmentation &amp; Personalization, Pre-Launch QA, Templates &amp; Reusable Components, A/B Testing</w:t>
       </w:r>
     </w:p>
     <w:p>

</xml_diff>